<commit_message>
`notaspese-pdf-builder: grassetto su Area/Settore in intestazione pagina 1`
</commit_message>
<xml_diff>
--- a/your-extensions/widgets/_shared/gii-anteprime/documenti-tecnici/rapporto/notaspese-template.docx
+++ b/your-extensions/widgets/_shared/gii-anteprime/documenti-tecnici/rapporto/notaspese-template.docx
@@ -357,31 +357,7 @@
               <w:szCs w:val="10"/>
               <w:lang w:val="en-US" w:eastAsia="en-US"/>
             </w:rPr>
-            <w:t xml:space="preserve">web </w:t>
-          </w:r>
-          <w:proofErr w:type="gramStart"/>
-          <w:r>
-            <w:rPr>
-              <w:rFonts w:ascii="Arial" w:eastAsia="Arial" w:hAnsi="Arial" w:cs="Arial"/>
-              <w:bCs/>
-              <w:color w:val="auto"/>
-              <w:sz w:val="10"/>
-              <w:szCs w:val="10"/>
-              <w:lang w:val="en-US" w:eastAsia="en-US"/>
-            </w:rPr>
-            <w:t>http://www.cbsm.it  email</w:t>
-          </w:r>
-          <w:proofErr w:type="gramEnd"/>
-          <w:r>
-            <w:rPr>
-              <w:rFonts w:ascii="Arial" w:eastAsia="Arial" w:hAnsi="Arial" w:cs="Arial"/>
-              <w:bCs/>
-              <w:color w:val="auto"/>
-              <w:sz w:val="10"/>
-              <w:szCs w:val="10"/>
-              <w:lang w:val="en-US" w:eastAsia="en-US"/>
-            </w:rPr>
-            <w:t xml:space="preserve"> </w:t>
+            <w:t xml:space="preserve">web http://www.cbsm.it  email </w:t>
           </w:r>
           <w:hyperlink r:id="rId1" w:history="1">
             <w:r>

</xml_diff>